<commit_message>
se corrige nombre en doc
</commit_message>
<xml_diff>
--- a/doc/Instructivo_Despliegue_RUFEM.docx
+++ b/doc/Instructivo_Despliegue_RUFEM.docx
@@ -108,7 +108,23 @@
           <w:sz w:val="22"/>
           <w:szCs w:val="22"/>
         </w:rPr>
-        <w:t>RUFEM tiene como objetivo el registro, sistematización y análisis de información vinculada a la muerte violenta de mujeres, con el fin de establecer la ruta crítica del caso. Su alcance incluye a la Secretaría de Estado de Igualdad y Diversidad (SMGyD) y a otros organismos vinculados con la temática (MPA, CAJ, PGCSJ, entre otros). Los usuarios que acceden al sistema son el personal designado por cada organismo correspondiente, autenticado a través del SSO institucional (CAS).</w:t>
+        <w:t xml:space="preserve">RUFEM tiene como objetivo el registro, sistematización y análisis de información vinculada a la muerte violenta de mujeres, con el fin de establecer la ruta crítica del caso. Su alcance incluye a la Secretaría de </w:t>
+      </w:r>
+      <w:r>
+        <w:rPr>
+          <w:rFonts w:eastAsia="Calibri" w:cs="Calibri" w:ascii="Calibri" w:hAnsi="Calibri"/>
+          <w:sz w:val="22"/>
+          <w:szCs w:val="22"/>
+        </w:rPr>
+        <w:t>Mujeres,Género y Diversidad</w:t>
+      </w:r>
+      <w:r>
+        <w:rPr>
+          <w:rFonts w:eastAsia="Calibri" w:cs="Calibri" w:ascii="Calibri" w:hAnsi="Calibri"/>
+          <w:sz w:val="22"/>
+          <w:szCs w:val="22"/>
+        </w:rPr>
+        <w:t xml:space="preserve"> (SMGyD) y a otros organismos vinculados con la temática (MPA, CAJ, PGCSJ, entre otros). Los usuarios que acceden al sistema son el personal designado por cada organismo correspondiente, autenticado a través del SSO institucional (CAS).</w:t>
       </w:r>
     </w:p>
     <w:p>
@@ -173,7 +189,7 @@
         <w:pStyle w:val="ListParagraph"/>
         <w:numPr>
           <w:ilvl w:val="0"/>
-          <w:numId w:val="5"/>
+          <w:numId w:val="8"/>
         </w:numPr>
         <w:spacing w:before="0" w:after="80"/>
         <w:rPr/>
@@ -192,7 +208,7 @@
         <w:pStyle w:val="ListParagraph"/>
         <w:numPr>
           <w:ilvl w:val="0"/>
-          <w:numId w:val="1"/>
+          <w:numId w:val="9"/>
         </w:numPr>
         <w:spacing w:before="0" w:after="80"/>
         <w:rPr/>
@@ -211,7 +227,7 @@
         <w:pStyle w:val="ListParagraph"/>
         <w:numPr>
           <w:ilvl w:val="0"/>
-          <w:numId w:val="1"/>
+          <w:numId w:val="10"/>
         </w:numPr>
         <w:spacing w:before="0" w:after="80"/>
         <w:rPr/>
@@ -230,7 +246,7 @@
         <w:pStyle w:val="ListParagraph"/>
         <w:numPr>
           <w:ilvl w:val="0"/>
-          <w:numId w:val="1"/>
+          <w:numId w:val="11"/>
         </w:numPr>
         <w:spacing w:before="0" w:after="80"/>
         <w:rPr/>
@@ -249,7 +265,7 @@
         <w:pStyle w:val="ListParagraph"/>
         <w:numPr>
           <w:ilvl w:val="0"/>
-          <w:numId w:val="1"/>
+          <w:numId w:val="12"/>
         </w:numPr>
         <w:spacing w:before="0" w:after="80"/>
         <w:rPr/>
@@ -279,7 +295,7 @@
         <w:pStyle w:val="ListParagraph"/>
         <w:numPr>
           <w:ilvl w:val="0"/>
-          <w:numId w:val="1"/>
+          <w:numId w:val="13"/>
         </w:numPr>
         <w:spacing w:before="0" w:after="80"/>
         <w:rPr/>
@@ -298,7 +314,7 @@
         <w:pStyle w:val="ListParagraph"/>
         <w:numPr>
           <w:ilvl w:val="0"/>
-          <w:numId w:val="1"/>
+          <w:numId w:val="14"/>
         </w:numPr>
         <w:spacing w:before="0" w:after="80"/>
         <w:rPr/>
@@ -317,7 +333,7 @@
         <w:pStyle w:val="ListParagraph"/>
         <w:numPr>
           <w:ilvl w:val="0"/>
-          <w:numId w:val="1"/>
+          <w:numId w:val="15"/>
         </w:numPr>
         <w:spacing w:before="0" w:after="80"/>
         <w:rPr/>
@@ -336,7 +352,7 @@
         <w:pStyle w:val="ListParagraph"/>
         <w:numPr>
           <w:ilvl w:val="0"/>
-          <w:numId w:val="1"/>
+          <w:numId w:val="16"/>
         </w:numPr>
         <w:spacing w:before="0" w:after="80"/>
         <w:rPr/>
@@ -355,7 +371,7 @@
         <w:pStyle w:val="ListParagraph"/>
         <w:numPr>
           <w:ilvl w:val="0"/>
-          <w:numId w:val="1"/>
+          <w:numId w:val="17"/>
         </w:numPr>
         <w:spacing w:before="0" w:after="80"/>
         <w:rPr/>
@@ -374,7 +390,7 @@
         <w:pStyle w:val="ListParagraph"/>
         <w:numPr>
           <w:ilvl w:val="0"/>
-          <w:numId w:val="1"/>
+          <w:numId w:val="18"/>
         </w:numPr>
         <w:spacing w:before="0" w:after="80"/>
         <w:rPr/>
@@ -429,8 +445,8 @@
       </w:tblPr>
       <w:tblGrid>
         <w:gridCol w:w="2200"/>
-        <w:gridCol w:w="4649"/>
-        <w:gridCol w:w="2501"/>
+        <w:gridCol w:w="4648"/>
+        <w:gridCol w:w="2502"/>
       </w:tblGrid>
       <w:tr>
         <w:trPr>
@@ -467,7 +483,7 @@
         </w:tc>
         <w:tc>
           <w:tcPr>
-            <w:tcW w:w="4649" w:type="dxa"/>
+            <w:tcW w:w="4648" w:type="dxa"/>
             <w:tcBorders>
               <w:top w:val="single" w:sz="4" w:space="0" w:color="000000"/>
               <w:left w:val="single" w:sz="4" w:space="0" w:color="000000"/>
@@ -496,7 +512,7 @@
         </w:tc>
         <w:tc>
           <w:tcPr>
-            <w:tcW w:w="2501" w:type="dxa"/>
+            <w:tcW w:w="2502" w:type="dxa"/>
             <w:tcBorders>
               <w:top w:val="single" w:sz="4" w:space="0" w:color="000000"/>
               <w:left w:val="single" w:sz="4" w:space="0" w:color="000000"/>
@@ -555,7 +571,7 @@
         </w:tc>
         <w:tc>
           <w:tcPr>
-            <w:tcW w:w="4649" w:type="dxa"/>
+            <w:tcW w:w="4648" w:type="dxa"/>
             <w:tcBorders>
               <w:top w:val="single" w:sz="4" w:space="0" w:color="000000"/>
               <w:left w:val="single" w:sz="4" w:space="0" w:color="000000"/>
@@ -582,7 +598,7 @@
         </w:tc>
         <w:tc>
           <w:tcPr>
-            <w:tcW w:w="2501" w:type="dxa"/>
+            <w:tcW w:w="2502" w:type="dxa"/>
             <w:tcBorders>
               <w:top w:val="single" w:sz="4" w:space="0" w:color="000000"/>
               <w:left w:val="single" w:sz="4" w:space="0" w:color="000000"/>
@@ -639,7 +655,7 @@
         </w:tc>
         <w:tc>
           <w:tcPr>
-            <w:tcW w:w="4649" w:type="dxa"/>
+            <w:tcW w:w="4648" w:type="dxa"/>
             <w:tcBorders>
               <w:top w:val="single" w:sz="4" w:space="0" w:color="000000"/>
               <w:left w:val="single" w:sz="4" w:space="0" w:color="000000"/>
@@ -666,7 +682,7 @@
         </w:tc>
         <w:tc>
           <w:tcPr>
-            <w:tcW w:w="2501" w:type="dxa"/>
+            <w:tcW w:w="2502" w:type="dxa"/>
             <w:tcBorders>
               <w:top w:val="single" w:sz="4" w:space="0" w:color="000000"/>
               <w:left w:val="single" w:sz="4" w:space="0" w:color="000000"/>
@@ -723,7 +739,7 @@
         </w:tc>
         <w:tc>
           <w:tcPr>
-            <w:tcW w:w="4649" w:type="dxa"/>
+            <w:tcW w:w="4648" w:type="dxa"/>
             <w:tcBorders>
               <w:top w:val="single" w:sz="4" w:space="0" w:color="000000"/>
               <w:left w:val="single" w:sz="4" w:space="0" w:color="000000"/>
@@ -750,7 +766,7 @@
         </w:tc>
         <w:tc>
           <w:tcPr>
-            <w:tcW w:w="2501" w:type="dxa"/>
+            <w:tcW w:w="2502" w:type="dxa"/>
             <w:tcBorders>
               <w:top w:val="single" w:sz="4" w:space="0" w:color="000000"/>
               <w:left w:val="single" w:sz="4" w:space="0" w:color="000000"/>
@@ -807,7 +823,7 @@
         </w:tc>
         <w:tc>
           <w:tcPr>
-            <w:tcW w:w="4649" w:type="dxa"/>
+            <w:tcW w:w="4648" w:type="dxa"/>
             <w:tcBorders>
               <w:top w:val="single" w:sz="4" w:space="0" w:color="000000"/>
               <w:left w:val="single" w:sz="4" w:space="0" w:color="000000"/>
@@ -834,7 +850,7 @@
         </w:tc>
         <w:tc>
           <w:tcPr>
-            <w:tcW w:w="2501" w:type="dxa"/>
+            <w:tcW w:w="2502" w:type="dxa"/>
             <w:tcBorders>
               <w:top w:val="single" w:sz="4" w:space="0" w:color="000000"/>
               <w:left w:val="single" w:sz="4" w:space="0" w:color="000000"/>
@@ -891,7 +907,7 @@
         </w:tc>
         <w:tc>
           <w:tcPr>
-            <w:tcW w:w="4649" w:type="dxa"/>
+            <w:tcW w:w="4648" w:type="dxa"/>
             <w:tcBorders>
               <w:top w:val="single" w:sz="4" w:space="0" w:color="000000"/>
               <w:left w:val="single" w:sz="4" w:space="0" w:color="000000"/>
@@ -918,7 +934,7 @@
         </w:tc>
         <w:tc>
           <w:tcPr>
-            <w:tcW w:w="2501" w:type="dxa"/>
+            <w:tcW w:w="2502" w:type="dxa"/>
             <w:tcBorders>
               <w:top w:val="single" w:sz="4" w:space="0" w:color="000000"/>
               <w:left w:val="single" w:sz="4" w:space="0" w:color="000000"/>
@@ -975,7 +991,7 @@
         </w:tc>
         <w:tc>
           <w:tcPr>
-            <w:tcW w:w="4649" w:type="dxa"/>
+            <w:tcW w:w="4648" w:type="dxa"/>
             <w:tcBorders>
               <w:top w:val="single" w:sz="4" w:space="0" w:color="000000"/>
               <w:left w:val="single" w:sz="4" w:space="0" w:color="000000"/>
@@ -1002,7 +1018,7 @@
         </w:tc>
         <w:tc>
           <w:tcPr>
-            <w:tcW w:w="2501" w:type="dxa"/>
+            <w:tcW w:w="2502" w:type="dxa"/>
             <w:tcBorders>
               <w:top w:val="single" w:sz="4" w:space="0" w:color="000000"/>
               <w:left w:val="single" w:sz="4" w:space="0" w:color="000000"/>
@@ -1085,7 +1101,7 @@
         <w:pStyle w:val="ListParagraph"/>
         <w:numPr>
           <w:ilvl w:val="0"/>
-          <w:numId w:val="6"/>
+          <w:numId w:val="19"/>
         </w:numPr>
         <w:spacing w:before="0" w:after="120"/>
         <w:rPr/>
@@ -1104,7 +1120,7 @@
         <w:pStyle w:val="ListParagraph"/>
         <w:numPr>
           <w:ilvl w:val="0"/>
-          <w:numId w:val="2"/>
+          <w:numId w:val="20"/>
         </w:numPr>
         <w:spacing w:before="0" w:after="120"/>
         <w:rPr/>
@@ -1123,7 +1139,7 @@
         <w:pStyle w:val="ListParagraph"/>
         <w:numPr>
           <w:ilvl w:val="0"/>
-          <w:numId w:val="2"/>
+          <w:numId w:val="21"/>
         </w:numPr>
         <w:spacing w:before="0" w:after="120"/>
         <w:rPr/>
@@ -1142,7 +1158,7 @@
         <w:pStyle w:val="ListParagraph"/>
         <w:numPr>
           <w:ilvl w:val="0"/>
-          <w:numId w:val="2"/>
+          <w:numId w:val="22"/>
         </w:numPr>
         <w:spacing w:before="0" w:after="120"/>
         <w:rPr>
@@ -1176,7 +1192,7 @@
         <w:pStyle w:val="ListParagraph"/>
         <w:numPr>
           <w:ilvl w:val="0"/>
-          <w:numId w:val="7"/>
+          <w:numId w:val="23"/>
         </w:numPr>
         <w:spacing w:before="0" w:after="120"/>
         <w:rPr/>
@@ -1211,7 +1227,7 @@
         <w:pStyle w:val="ListParagraph"/>
         <w:numPr>
           <w:ilvl w:val="0"/>
-          <w:numId w:val="3"/>
+          <w:numId w:val="24"/>
         </w:numPr>
         <w:spacing w:before="0" w:after="120"/>
         <w:rPr/>
@@ -1230,7 +1246,7 @@
         <w:pStyle w:val="ListParagraph"/>
         <w:numPr>
           <w:ilvl w:val="0"/>
-          <w:numId w:val="3"/>
+          <w:numId w:val="25"/>
         </w:numPr>
         <w:spacing w:before="0" w:after="120"/>
         <w:rPr/>
@@ -1265,7 +1281,7 @@
         <w:pStyle w:val="ListParagraph"/>
         <w:numPr>
           <w:ilvl w:val="0"/>
-          <w:numId w:val="3"/>
+          <w:numId w:val="26"/>
         </w:numPr>
         <w:spacing w:before="0" w:after="120"/>
         <w:rPr/>
@@ -1300,7 +1316,7 @@
         <w:pStyle w:val="ListParagraph"/>
         <w:numPr>
           <w:ilvl w:val="0"/>
-          <w:numId w:val="3"/>
+          <w:numId w:val="27"/>
         </w:numPr>
         <w:spacing w:before="0" w:after="120"/>
         <w:rPr/>
@@ -1335,7 +1351,7 @@
         <w:pStyle w:val="ListParagraph"/>
         <w:numPr>
           <w:ilvl w:val="0"/>
-          <w:numId w:val="3"/>
+          <w:numId w:val="28"/>
         </w:numPr>
         <w:spacing w:before="0" w:after="120"/>
         <w:rPr/>
@@ -1370,7 +1386,7 @@
         <w:pStyle w:val="ListParagraph"/>
         <w:numPr>
           <w:ilvl w:val="0"/>
-          <w:numId w:val="3"/>
+          <w:numId w:val="29"/>
         </w:numPr>
         <w:spacing w:before="0" w:after="120"/>
         <w:rPr/>
@@ -1405,7 +1421,7 @@
         <w:pStyle w:val="ListParagraph"/>
         <w:numPr>
           <w:ilvl w:val="0"/>
-          <w:numId w:val="3"/>
+          <w:numId w:val="30"/>
         </w:numPr>
         <w:spacing w:before="0" w:after="120"/>
         <w:rPr/>
@@ -1424,7 +1440,7 @@
         <w:pStyle w:val="ListParagraph"/>
         <w:numPr>
           <w:ilvl w:val="0"/>
-          <w:numId w:val="3"/>
+          <w:numId w:val="31"/>
         </w:numPr>
         <w:spacing w:before="0" w:after="120"/>
         <w:rPr/>
@@ -1454,7 +1470,7 @@
         <w:pStyle w:val="ListParagraph"/>
         <w:numPr>
           <w:ilvl w:val="0"/>
-          <w:numId w:val="1"/>
+          <w:numId w:val="32"/>
         </w:numPr>
         <w:spacing w:before="0" w:after="80"/>
         <w:rPr/>
@@ -1473,7 +1489,7 @@
         <w:pStyle w:val="ListParagraph"/>
         <w:numPr>
           <w:ilvl w:val="0"/>
-          <w:numId w:val="1"/>
+          <w:numId w:val="33"/>
         </w:numPr>
         <w:spacing w:before="0" w:after="80"/>
         <w:rPr/>
@@ -1492,7 +1508,7 @@
         <w:pStyle w:val="ListParagraph"/>
         <w:numPr>
           <w:ilvl w:val="0"/>
-          <w:numId w:val="1"/>
+          <w:numId w:val="34"/>
         </w:numPr>
         <w:spacing w:before="0" w:after="80"/>
         <w:rPr/>
@@ -1511,7 +1527,7 @@
         <w:pStyle w:val="ListParagraph"/>
         <w:numPr>
           <w:ilvl w:val="0"/>
-          <w:numId w:val="1"/>
+          <w:numId w:val="35"/>
         </w:numPr>
         <w:spacing w:before="0" w:after="80"/>
         <w:rPr/>
@@ -1530,7 +1546,7 @@
         <w:pStyle w:val="ListParagraph"/>
         <w:numPr>
           <w:ilvl w:val="0"/>
-          <w:numId w:val="1"/>
+          <w:numId w:val="36"/>
         </w:numPr>
         <w:spacing w:before="0" w:after="80"/>
         <w:rPr/>
@@ -1549,7 +1565,7 @@
         <w:pStyle w:val="ListParagraph"/>
         <w:numPr>
           <w:ilvl w:val="0"/>
-          <w:numId w:val="1"/>
+          <w:numId w:val="37"/>
         </w:numPr>
         <w:spacing w:before="0" w:after="80"/>
         <w:rPr/>
@@ -1631,6 +1647,7 @@
         </w:tabs>
         <w:ind w:left="1080" w:hanging="360"/>
       </w:pPr>
+      <w:rPr/>
     </w:lvl>
     <w:lvl w:ilvl="2">
       <w:start w:val="1"/>
@@ -1643,6 +1660,7 @@
         </w:tabs>
         <w:ind w:left="1440" w:hanging="360"/>
       </w:pPr>
+      <w:rPr/>
     </w:lvl>
     <w:lvl w:ilvl="3">
       <w:start w:val="1"/>
@@ -1655,6 +1673,7 @@
         </w:tabs>
         <w:ind w:left="1800" w:hanging="360"/>
       </w:pPr>
+      <w:rPr/>
     </w:lvl>
     <w:lvl w:ilvl="4">
       <w:start w:val="1"/>
@@ -1667,6 +1686,7 @@
         </w:tabs>
         <w:ind w:left="2160" w:hanging="360"/>
       </w:pPr>
+      <w:rPr/>
     </w:lvl>
     <w:lvl w:ilvl="5">
       <w:start w:val="1"/>
@@ -1679,6 +1699,7 @@
         </w:tabs>
         <w:ind w:left="2520" w:hanging="360"/>
       </w:pPr>
+      <w:rPr/>
     </w:lvl>
     <w:lvl w:ilvl="6">
       <w:start w:val="1"/>
@@ -1691,6 +1712,7 @@
         </w:tabs>
         <w:ind w:left="2880" w:hanging="360"/>
       </w:pPr>
+      <w:rPr/>
     </w:lvl>
     <w:lvl w:ilvl="7">
       <w:start w:val="1"/>
@@ -1703,6 +1725,7 @@
         </w:tabs>
         <w:ind w:left="3240" w:hanging="360"/>
       </w:pPr>
+      <w:rPr/>
     </w:lvl>
     <w:lvl w:ilvl="8">
       <w:start w:val="1"/>
@@ -1715,6 +1738,7 @@
         </w:tabs>
         <w:ind w:left="3600" w:hanging="360"/>
       </w:pPr>
+      <w:rPr/>
     </w:lvl>
   </w:abstractNum>
   <w:abstractNum w:abstractNumId="2">
@@ -1742,6 +1766,7 @@
         </w:tabs>
         <w:ind w:left="1080" w:hanging="360"/>
       </w:pPr>
+      <w:rPr/>
     </w:lvl>
     <w:lvl w:ilvl="2">
       <w:start w:val="1"/>
@@ -1754,6 +1779,7 @@
         </w:tabs>
         <w:ind w:left="1440" w:hanging="360"/>
       </w:pPr>
+      <w:rPr/>
     </w:lvl>
     <w:lvl w:ilvl="3">
       <w:start w:val="1"/>
@@ -1766,6 +1792,7 @@
         </w:tabs>
         <w:ind w:left="1800" w:hanging="360"/>
       </w:pPr>
+      <w:rPr/>
     </w:lvl>
     <w:lvl w:ilvl="4">
       <w:start w:val="1"/>
@@ -1778,6 +1805,7 @@
         </w:tabs>
         <w:ind w:left="2160" w:hanging="360"/>
       </w:pPr>
+      <w:rPr/>
     </w:lvl>
     <w:lvl w:ilvl="5">
       <w:start w:val="1"/>
@@ -1790,6 +1818,7 @@
         </w:tabs>
         <w:ind w:left="2520" w:hanging="360"/>
       </w:pPr>
+      <w:rPr/>
     </w:lvl>
     <w:lvl w:ilvl="6">
       <w:start w:val="1"/>
@@ -1802,6 +1831,7 @@
         </w:tabs>
         <w:ind w:left="2880" w:hanging="360"/>
       </w:pPr>
+      <w:rPr/>
     </w:lvl>
     <w:lvl w:ilvl="7">
       <w:start w:val="1"/>
@@ -1814,6 +1844,7 @@
         </w:tabs>
         <w:ind w:left="3240" w:hanging="360"/>
       </w:pPr>
+      <w:rPr/>
     </w:lvl>
     <w:lvl w:ilvl="8">
       <w:start w:val="1"/>
@@ -1826,6 +1857,7 @@
         </w:tabs>
         <w:ind w:left="3600" w:hanging="360"/>
       </w:pPr>
+      <w:rPr/>
     </w:lvl>
   </w:abstractNum>
   <w:abstractNum w:abstractNumId="3">
@@ -1853,6 +1885,7 @@
         </w:tabs>
         <w:ind w:left="1080" w:hanging="360"/>
       </w:pPr>
+      <w:rPr/>
     </w:lvl>
     <w:lvl w:ilvl="2">
       <w:start w:val="1"/>
@@ -1865,6 +1898,7 @@
         </w:tabs>
         <w:ind w:left="1440" w:hanging="360"/>
       </w:pPr>
+      <w:rPr/>
     </w:lvl>
     <w:lvl w:ilvl="3">
       <w:start w:val="1"/>
@@ -1877,6 +1911,7 @@
         </w:tabs>
         <w:ind w:left="1800" w:hanging="360"/>
       </w:pPr>
+      <w:rPr/>
     </w:lvl>
     <w:lvl w:ilvl="4">
       <w:start w:val="1"/>
@@ -1889,6 +1924,7 @@
         </w:tabs>
         <w:ind w:left="2160" w:hanging="360"/>
       </w:pPr>
+      <w:rPr/>
     </w:lvl>
     <w:lvl w:ilvl="5">
       <w:start w:val="1"/>
@@ -1901,6 +1937,7 @@
         </w:tabs>
         <w:ind w:left="2520" w:hanging="360"/>
       </w:pPr>
+      <w:rPr/>
     </w:lvl>
     <w:lvl w:ilvl="6">
       <w:start w:val="1"/>
@@ -1913,6 +1950,7 @@
         </w:tabs>
         <w:ind w:left="2880" w:hanging="360"/>
       </w:pPr>
+      <w:rPr/>
     </w:lvl>
     <w:lvl w:ilvl="7">
       <w:start w:val="1"/>
@@ -1925,6 +1963,7 @@
         </w:tabs>
         <w:ind w:left="3240" w:hanging="360"/>
       </w:pPr>
+      <w:rPr/>
     </w:lvl>
     <w:lvl w:ilvl="8">
       <w:start w:val="1"/>
@@ -1937,11 +1976,371 @@
         </w:tabs>
         <w:ind w:left="3600" w:hanging="360"/>
       </w:pPr>
+      <w:rPr/>
     </w:lvl>
   </w:abstractNum>
   <w:abstractNum w:abstractNumId="4">
     <w:lvl w:ilvl="0">
       <w:start w:val="1"/>
+      <w:numFmt w:val="bullet"/>
+      <w:lvlText w:val=""/>
+      <w:lvlJc w:val="left"/>
+      <w:pPr>
+        <w:tabs>
+          <w:tab w:val="num" w:pos="0"/>
+        </w:tabs>
+        <w:ind w:left="420" w:hanging="260"/>
+      </w:pPr>
+      <w:rPr>
+        <w:rFonts w:ascii="Symbol" w:hAnsi="Symbol" w:cs="Symbol" w:hint="default"/>
+      </w:rPr>
+    </w:lvl>
+    <w:lvl w:ilvl="1">
+      <w:start w:val="1"/>
+      <w:numFmt w:val="decimal"/>
+      <w:lvlText w:val="%2."/>
+      <w:lvlJc w:val="left"/>
+      <w:pPr>
+        <w:tabs>
+          <w:tab w:val="num" w:pos="1080"/>
+        </w:tabs>
+        <w:ind w:left="1080" w:hanging="360"/>
+      </w:pPr>
+      <w:rPr/>
+    </w:lvl>
+    <w:lvl w:ilvl="2">
+      <w:start w:val="1"/>
+      <w:numFmt w:val="decimal"/>
+      <w:lvlText w:val="%3."/>
+      <w:lvlJc w:val="left"/>
+      <w:pPr>
+        <w:tabs>
+          <w:tab w:val="num" w:pos="1440"/>
+        </w:tabs>
+        <w:ind w:left="1440" w:hanging="360"/>
+      </w:pPr>
+      <w:rPr/>
+    </w:lvl>
+    <w:lvl w:ilvl="3">
+      <w:start w:val="1"/>
+      <w:numFmt w:val="decimal"/>
+      <w:lvlText w:val="%4."/>
+      <w:lvlJc w:val="left"/>
+      <w:pPr>
+        <w:tabs>
+          <w:tab w:val="num" w:pos="1800"/>
+        </w:tabs>
+        <w:ind w:left="1800" w:hanging="360"/>
+      </w:pPr>
+      <w:rPr/>
+    </w:lvl>
+    <w:lvl w:ilvl="4">
+      <w:start w:val="1"/>
+      <w:numFmt w:val="decimal"/>
+      <w:lvlText w:val="%5."/>
+      <w:lvlJc w:val="left"/>
+      <w:pPr>
+        <w:tabs>
+          <w:tab w:val="num" w:pos="2160"/>
+        </w:tabs>
+        <w:ind w:left="2160" w:hanging="360"/>
+      </w:pPr>
+      <w:rPr/>
+    </w:lvl>
+    <w:lvl w:ilvl="5">
+      <w:start w:val="1"/>
+      <w:numFmt w:val="decimal"/>
+      <w:lvlText w:val="%6."/>
+      <w:lvlJc w:val="left"/>
+      <w:pPr>
+        <w:tabs>
+          <w:tab w:val="num" w:pos="2520"/>
+        </w:tabs>
+        <w:ind w:left="2520" w:hanging="360"/>
+      </w:pPr>
+      <w:rPr/>
+    </w:lvl>
+    <w:lvl w:ilvl="6">
+      <w:start w:val="1"/>
+      <w:numFmt w:val="decimal"/>
+      <w:lvlText w:val="%7."/>
+      <w:lvlJc w:val="left"/>
+      <w:pPr>
+        <w:tabs>
+          <w:tab w:val="num" w:pos="2880"/>
+        </w:tabs>
+        <w:ind w:left="2880" w:hanging="360"/>
+      </w:pPr>
+      <w:rPr/>
+    </w:lvl>
+    <w:lvl w:ilvl="7">
+      <w:start w:val="1"/>
+      <w:numFmt w:val="decimal"/>
+      <w:lvlText w:val="%8."/>
+      <w:lvlJc w:val="left"/>
+      <w:pPr>
+        <w:tabs>
+          <w:tab w:val="num" w:pos="3240"/>
+        </w:tabs>
+        <w:ind w:left="3240" w:hanging="360"/>
+      </w:pPr>
+      <w:rPr/>
+    </w:lvl>
+    <w:lvl w:ilvl="8">
+      <w:start w:val="1"/>
+      <w:numFmt w:val="decimal"/>
+      <w:lvlText w:val="%9."/>
+      <w:lvlJc w:val="left"/>
+      <w:pPr>
+        <w:tabs>
+          <w:tab w:val="num" w:pos="3600"/>
+        </w:tabs>
+        <w:ind w:left="3600" w:hanging="360"/>
+      </w:pPr>
+      <w:rPr/>
+    </w:lvl>
+  </w:abstractNum>
+  <w:abstractNum w:abstractNumId="5">
+    <w:lvl w:ilvl="0">
+      <w:start w:val="1"/>
+      <w:numFmt w:val="decimal"/>
+      <w:lvlText w:val="%1."/>
+      <w:lvlJc w:val="left"/>
+      <w:pPr>
+        <w:tabs>
+          <w:tab w:val="num" w:pos="0"/>
+        </w:tabs>
+        <w:ind w:left="420" w:hanging="260"/>
+      </w:pPr>
+      <w:rPr/>
+    </w:lvl>
+    <w:lvl w:ilvl="1">
+      <w:start w:val="1"/>
+      <w:numFmt w:val="decimal"/>
+      <w:lvlText w:val="%2."/>
+      <w:lvlJc w:val="left"/>
+      <w:pPr>
+        <w:tabs>
+          <w:tab w:val="num" w:pos="1080"/>
+        </w:tabs>
+        <w:ind w:left="1080" w:hanging="360"/>
+      </w:pPr>
+      <w:rPr/>
+    </w:lvl>
+    <w:lvl w:ilvl="2">
+      <w:start w:val="1"/>
+      <w:numFmt w:val="decimal"/>
+      <w:lvlText w:val="%3."/>
+      <w:lvlJc w:val="left"/>
+      <w:pPr>
+        <w:tabs>
+          <w:tab w:val="num" w:pos="1440"/>
+        </w:tabs>
+        <w:ind w:left="1440" w:hanging="360"/>
+      </w:pPr>
+      <w:rPr/>
+    </w:lvl>
+    <w:lvl w:ilvl="3">
+      <w:start w:val="1"/>
+      <w:numFmt w:val="decimal"/>
+      <w:lvlText w:val="%4."/>
+      <w:lvlJc w:val="left"/>
+      <w:pPr>
+        <w:tabs>
+          <w:tab w:val="num" w:pos="1800"/>
+        </w:tabs>
+        <w:ind w:left="1800" w:hanging="360"/>
+      </w:pPr>
+      <w:rPr/>
+    </w:lvl>
+    <w:lvl w:ilvl="4">
+      <w:start w:val="1"/>
+      <w:numFmt w:val="decimal"/>
+      <w:lvlText w:val="%5."/>
+      <w:lvlJc w:val="left"/>
+      <w:pPr>
+        <w:tabs>
+          <w:tab w:val="num" w:pos="2160"/>
+        </w:tabs>
+        <w:ind w:left="2160" w:hanging="360"/>
+      </w:pPr>
+      <w:rPr/>
+    </w:lvl>
+    <w:lvl w:ilvl="5">
+      <w:start w:val="1"/>
+      <w:numFmt w:val="decimal"/>
+      <w:lvlText w:val="%6."/>
+      <w:lvlJc w:val="left"/>
+      <w:pPr>
+        <w:tabs>
+          <w:tab w:val="num" w:pos="2520"/>
+        </w:tabs>
+        <w:ind w:left="2520" w:hanging="360"/>
+      </w:pPr>
+      <w:rPr/>
+    </w:lvl>
+    <w:lvl w:ilvl="6">
+      <w:start w:val="1"/>
+      <w:numFmt w:val="decimal"/>
+      <w:lvlText w:val="%7."/>
+      <w:lvlJc w:val="left"/>
+      <w:pPr>
+        <w:tabs>
+          <w:tab w:val="num" w:pos="2880"/>
+        </w:tabs>
+        <w:ind w:left="2880" w:hanging="360"/>
+      </w:pPr>
+      <w:rPr/>
+    </w:lvl>
+    <w:lvl w:ilvl="7">
+      <w:start w:val="1"/>
+      <w:numFmt w:val="decimal"/>
+      <w:lvlText w:val="%8."/>
+      <w:lvlJc w:val="left"/>
+      <w:pPr>
+        <w:tabs>
+          <w:tab w:val="num" w:pos="3240"/>
+        </w:tabs>
+        <w:ind w:left="3240" w:hanging="360"/>
+      </w:pPr>
+      <w:rPr/>
+    </w:lvl>
+    <w:lvl w:ilvl="8">
+      <w:start w:val="1"/>
+      <w:numFmt w:val="decimal"/>
+      <w:lvlText w:val="%9."/>
+      <w:lvlJc w:val="left"/>
+      <w:pPr>
+        <w:tabs>
+          <w:tab w:val="num" w:pos="3600"/>
+        </w:tabs>
+        <w:ind w:left="3600" w:hanging="360"/>
+      </w:pPr>
+      <w:rPr/>
+    </w:lvl>
+  </w:abstractNum>
+  <w:abstractNum w:abstractNumId="6">
+    <w:lvl w:ilvl="0">
+      <w:start w:val="1"/>
+      <w:numFmt w:val="decimal"/>
+      <w:lvlText w:val="%1."/>
+      <w:lvlJc w:val="left"/>
+      <w:pPr>
+        <w:tabs>
+          <w:tab w:val="num" w:pos="0"/>
+        </w:tabs>
+        <w:ind w:left="420" w:hanging="260"/>
+      </w:pPr>
+      <w:rPr/>
+    </w:lvl>
+    <w:lvl w:ilvl="1">
+      <w:start w:val="1"/>
+      <w:numFmt w:val="decimal"/>
+      <w:lvlText w:val="%2."/>
+      <w:lvlJc w:val="left"/>
+      <w:pPr>
+        <w:tabs>
+          <w:tab w:val="num" w:pos="1080"/>
+        </w:tabs>
+        <w:ind w:left="1080" w:hanging="360"/>
+      </w:pPr>
+      <w:rPr/>
+    </w:lvl>
+    <w:lvl w:ilvl="2">
+      <w:start w:val="1"/>
+      <w:numFmt w:val="decimal"/>
+      <w:lvlText w:val="%3."/>
+      <w:lvlJc w:val="left"/>
+      <w:pPr>
+        <w:tabs>
+          <w:tab w:val="num" w:pos="1440"/>
+        </w:tabs>
+        <w:ind w:left="1440" w:hanging="360"/>
+      </w:pPr>
+      <w:rPr/>
+    </w:lvl>
+    <w:lvl w:ilvl="3">
+      <w:start w:val="1"/>
+      <w:numFmt w:val="decimal"/>
+      <w:lvlText w:val="%4."/>
+      <w:lvlJc w:val="left"/>
+      <w:pPr>
+        <w:tabs>
+          <w:tab w:val="num" w:pos="1800"/>
+        </w:tabs>
+        <w:ind w:left="1800" w:hanging="360"/>
+      </w:pPr>
+      <w:rPr/>
+    </w:lvl>
+    <w:lvl w:ilvl="4">
+      <w:start w:val="1"/>
+      <w:numFmt w:val="decimal"/>
+      <w:lvlText w:val="%5."/>
+      <w:lvlJc w:val="left"/>
+      <w:pPr>
+        <w:tabs>
+          <w:tab w:val="num" w:pos="2160"/>
+        </w:tabs>
+        <w:ind w:left="2160" w:hanging="360"/>
+      </w:pPr>
+      <w:rPr/>
+    </w:lvl>
+    <w:lvl w:ilvl="5">
+      <w:start w:val="1"/>
+      <w:numFmt w:val="decimal"/>
+      <w:lvlText w:val="%6."/>
+      <w:lvlJc w:val="left"/>
+      <w:pPr>
+        <w:tabs>
+          <w:tab w:val="num" w:pos="2520"/>
+        </w:tabs>
+        <w:ind w:left="2520" w:hanging="360"/>
+      </w:pPr>
+      <w:rPr/>
+    </w:lvl>
+    <w:lvl w:ilvl="6">
+      <w:start w:val="1"/>
+      <w:numFmt w:val="decimal"/>
+      <w:lvlText w:val="%7."/>
+      <w:lvlJc w:val="left"/>
+      <w:pPr>
+        <w:tabs>
+          <w:tab w:val="num" w:pos="2880"/>
+        </w:tabs>
+        <w:ind w:left="2880" w:hanging="360"/>
+      </w:pPr>
+      <w:rPr/>
+    </w:lvl>
+    <w:lvl w:ilvl="7">
+      <w:start w:val="1"/>
+      <w:numFmt w:val="decimal"/>
+      <w:lvlText w:val="%8."/>
+      <w:lvlJc w:val="left"/>
+      <w:pPr>
+        <w:tabs>
+          <w:tab w:val="num" w:pos="3240"/>
+        </w:tabs>
+        <w:ind w:left="3240" w:hanging="360"/>
+      </w:pPr>
+      <w:rPr/>
+    </w:lvl>
+    <w:lvl w:ilvl="8">
+      <w:start w:val="1"/>
+      <w:numFmt w:val="decimal"/>
+      <w:lvlText w:val="%9."/>
+      <w:lvlJc w:val="left"/>
+      <w:pPr>
+        <w:tabs>
+          <w:tab w:val="num" w:pos="3600"/>
+        </w:tabs>
+        <w:ind w:left="3600" w:hanging="360"/>
+      </w:pPr>
+      <w:rPr/>
+    </w:lvl>
+  </w:abstractNum>
+  <w:abstractNum w:abstractNumId="7">
+    <w:lvl w:ilvl="0">
+      <w:start w:val="1"/>
       <w:numFmt w:val="none"/>
       <w:suff w:val="nothing"/>
       <w:lvlText w:val=""/>
@@ -2071,22 +2470,112 @@
     <w:abstractNumId w:val="4"/>
   </w:num>
   <w:num w:numId="5">
-    <w:abstractNumId w:val="1"/>
+    <w:abstractNumId w:val="5"/>
+  </w:num>
+  <w:num w:numId="6">
+    <w:abstractNumId w:val="6"/>
+  </w:num>
+  <w:num w:numId="7">
+    <w:abstractNumId w:val="7"/>
+  </w:num>
+  <w:num w:numId="8">
+    <w:abstractNumId w:val="4"/>
     <w:lvlOverride w:ilvl="0">
       <w:startOverride w:val="1"/>
     </w:lvlOverride>
   </w:num>
-  <w:num w:numId="6">
-    <w:abstractNumId w:val="2"/>
+  <w:num w:numId="9">
+    <w:abstractNumId w:val="4"/>
+  </w:num>
+  <w:num w:numId="10">
+    <w:abstractNumId w:val="4"/>
+  </w:num>
+  <w:num w:numId="11">
+    <w:abstractNumId w:val="4"/>
+  </w:num>
+  <w:num w:numId="12">
+    <w:abstractNumId w:val="4"/>
+  </w:num>
+  <w:num w:numId="13">
+    <w:abstractNumId w:val="4"/>
+  </w:num>
+  <w:num w:numId="14">
+    <w:abstractNumId w:val="4"/>
+  </w:num>
+  <w:num w:numId="15">
+    <w:abstractNumId w:val="4"/>
+  </w:num>
+  <w:num w:numId="16">
+    <w:abstractNumId w:val="4"/>
+  </w:num>
+  <w:num w:numId="17">
+    <w:abstractNumId w:val="4"/>
+  </w:num>
+  <w:num w:numId="18">
+    <w:abstractNumId w:val="4"/>
+  </w:num>
+  <w:num w:numId="19">
+    <w:abstractNumId w:val="5"/>
     <w:lvlOverride w:ilvl="0">
       <w:startOverride w:val="1"/>
     </w:lvlOverride>
   </w:num>
-  <w:num w:numId="7">
-    <w:abstractNumId w:val="3"/>
+  <w:num w:numId="20">
+    <w:abstractNumId w:val="5"/>
+  </w:num>
+  <w:num w:numId="21">
+    <w:abstractNumId w:val="5"/>
+  </w:num>
+  <w:num w:numId="22">
+    <w:abstractNumId w:val="5"/>
+  </w:num>
+  <w:num w:numId="23">
+    <w:abstractNumId w:val="6"/>
     <w:lvlOverride w:ilvl="0">
       <w:startOverride w:val="1"/>
     </w:lvlOverride>
+  </w:num>
+  <w:num w:numId="24">
+    <w:abstractNumId w:val="6"/>
+  </w:num>
+  <w:num w:numId="25">
+    <w:abstractNumId w:val="6"/>
+  </w:num>
+  <w:num w:numId="26">
+    <w:abstractNumId w:val="6"/>
+  </w:num>
+  <w:num w:numId="27">
+    <w:abstractNumId w:val="6"/>
+  </w:num>
+  <w:num w:numId="28">
+    <w:abstractNumId w:val="6"/>
+  </w:num>
+  <w:num w:numId="29">
+    <w:abstractNumId w:val="6"/>
+  </w:num>
+  <w:num w:numId="30">
+    <w:abstractNumId w:val="6"/>
+  </w:num>
+  <w:num w:numId="31">
+    <w:abstractNumId w:val="6"/>
+  </w:num>
+  <w:num w:numId="32">
+    <w:abstractNumId w:val="4"/>
+  </w:num>
+  <w:num w:numId="33">
+    <w:abstractNumId w:val="4"/>
+  </w:num>
+  <w:num w:numId="34">
+    <w:abstractNumId w:val="4"/>
+  </w:num>
+  <w:num w:numId="35">
+    <w:abstractNumId w:val="4"/>
+  </w:num>
+  <w:num w:numId="36">
+    <w:abstractNumId w:val="4"/>
+  </w:num>
+  <w:num w:numId="37">
+    <w:abstractNumId w:val="4"/>
   </w:num>
 </w:numbering>
 </file>
@@ -2111,6 +2600,7 @@
     <w:qFormat/>
     <w:pPr>
       <w:widowControl/>
+      <w:suppressAutoHyphens w:val="true"/>
       <w:bidi w:val="0"/>
       <w:spacing w:before="0" w:after="0"/>
       <w:jc w:val="left"/>
@@ -2322,6 +2812,7 @@
     <w:qFormat/>
     <w:pPr>
       <w:widowControl/>
+      <w:suppressAutoHyphens w:val="true"/>
       <w:bidi w:val="0"/>
       <w:spacing w:before="0" w:after="0"/>
       <w:jc w:val="left"/>
@@ -2342,6 +2833,7 @@
     <w:qFormat/>
     <w:pPr>
       <w:widowControl/>
+      <w:suppressAutoHyphens w:val="true"/>
       <w:bidi w:val="0"/>
       <w:spacing w:before="0" w:after="0"/>
       <w:jc w:val="left"/>

</xml_diff>